<commit_message>
Agrega los informes en PDF y mejora el conversor a Word
El conversor md_a_docx.py ahora hace tres cosas mas:

- Traduce los bloques mermaid a texto plano indentado, porque Word no los
  renderiza y salian como codigo crudo lleno de etiquetas <br/>.
- Saca en horizontal los documentos cuyo nombre empieza por TECNICO_, que
  llevan tablas de seis columnas ilegibles en vertical.
- Descarta el frontmatter YAML si el Markdown abre con el.

Se agregan Informe_Ecoli.pdf e Informe_Bank.pdf, exportados desde Word.
</commit_message>
<xml_diff>
--- a/Primera actividad/Informe_Bank.docx
+++ b/Primera actividad/Informe_Bank.docx
@@ -210,6 +210,7 @@
         <w:tblStyle w:val="LightGrid-Accent1"/>
         <w:tblW w:type="auto" w:w="0"/>
         <w:jc w:val="center"/>
+        <w:tblLayout w:type="autofit"/>
         <w:tblLook w:firstColumn="1" w:firstRow="1" w:lastColumn="0" w:lastRow="0" w:noHBand="0" w:noVBand="1" w:val="04A0"/>
       </w:tblPr>
       <w:tblGrid>
@@ -1417,6 +1418,7 @@
         <w:tblStyle w:val="LightGrid-Accent1"/>
         <w:tblW w:type="auto" w:w="0"/>
         <w:jc w:val="center"/>
+        <w:tblLayout w:type="autofit"/>
         <w:tblLook w:firstColumn="1" w:firstRow="1" w:lastColumn="0" w:lastRow="0" w:noHBand="0" w:noVBand="1" w:val="04A0"/>
       </w:tblPr>
       <w:tblGrid>
@@ -1803,6 +1805,7 @@
         <w:tblStyle w:val="LightGrid-Accent1"/>
         <w:tblW w:type="auto" w:w="0"/>
         <w:jc w:val="center"/>
+        <w:tblLayout w:type="autofit"/>
         <w:tblLook w:firstColumn="1" w:firstRow="1" w:lastColumn="0" w:lastRow="0" w:noHBand="0" w:noVBand="1" w:val="04A0"/>
       </w:tblPr>
       <w:tblGrid>
@@ -2274,6 +2277,7 @@
         <w:tblStyle w:val="LightGrid-Accent1"/>
         <w:tblW w:type="auto" w:w="0"/>
         <w:jc w:val="center"/>
+        <w:tblLayout w:type="autofit"/>
         <w:tblLook w:firstColumn="1" w:firstRow="1" w:lastColumn="0" w:lastRow="0" w:noHBand="0" w:noVBand="1" w:val="04A0"/>
       </w:tblPr>
       <w:tblGrid>
@@ -2820,6 +2824,7 @@
         <w:tblStyle w:val="LightGrid-Accent1"/>
         <w:tblW w:type="auto" w:w="0"/>
         <w:jc w:val="center"/>
+        <w:tblLayout w:type="autofit"/>
         <w:tblLook w:firstColumn="1" w:firstRow="1" w:lastColumn="0" w:lastRow="0" w:noHBand="0" w:noVBand="1" w:val="04A0"/>
       </w:tblPr>
       <w:tblGrid>
@@ -3134,6 +3139,7 @@
         <w:tblStyle w:val="LightGrid-Accent1"/>
         <w:tblW w:type="auto" w:w="0"/>
         <w:jc w:val="center"/>
+        <w:tblLayout w:type="autofit"/>
         <w:tblLook w:firstColumn="1" w:firstRow="1" w:lastColumn="0" w:lastRow="0" w:noHBand="0" w:noVBand="1" w:val="04A0"/>
       </w:tblPr>
       <w:tblGrid>
@@ -3448,6 +3454,7 @@
         <w:tblStyle w:val="LightGrid-Accent1"/>
         <w:tblW w:type="auto" w:w="0"/>
         <w:jc w:val="center"/>
+        <w:tblLayout w:type="autofit"/>
         <w:tblLook w:firstColumn="1" w:firstRow="1" w:lastColumn="0" w:lastRow="0" w:noHBand="0" w:noVBand="1" w:val="04A0"/>
       </w:tblPr>
       <w:tblGrid>
@@ -3890,6 +3897,7 @@
         <w:tblStyle w:val="LightGrid-Accent1"/>
         <w:tblW w:type="auto" w:w="0"/>
         <w:jc w:val="center"/>
+        <w:tblLayout w:type="autofit"/>
         <w:tblLook w:firstColumn="1" w:firstRow="1" w:lastColumn="0" w:lastRow="0" w:noHBand="0" w:noVBand="1" w:val="04A0"/>
       </w:tblPr>
       <w:tblGrid>
@@ -4250,6 +4258,7 @@
         <w:tblStyle w:val="LightGrid-Accent1"/>
         <w:tblW w:type="auto" w:w="0"/>
         <w:jc w:val="center"/>
+        <w:tblLayout w:type="autofit"/>
         <w:tblLook w:firstColumn="1" w:firstRow="1" w:lastColumn="0" w:lastRow="0" w:noHBand="0" w:noVBand="1" w:val="04A0"/>
       </w:tblPr>
       <w:tblGrid>
@@ -5402,6 +5411,7 @@
         <w:tblStyle w:val="LightGrid-Accent1"/>
         <w:tblW w:type="auto" w:w="0"/>
         <w:jc w:val="center"/>
+        <w:tblLayout w:type="autofit"/>
         <w:tblLook w:firstColumn="1" w:firstRow="1" w:lastColumn="0" w:lastRow="0" w:noHBand="0" w:noVBand="1" w:val="04A0"/>
       </w:tblPr>
       <w:tblGrid>
@@ -5625,6 +5635,7 @@
         <w:tblStyle w:val="LightGrid-Accent1"/>
         <w:tblW w:type="auto" w:w="0"/>
         <w:jc w:val="center"/>
+        <w:tblLayout w:type="autofit"/>
         <w:tblLook w:firstColumn="1" w:firstRow="1" w:lastColumn="0" w:lastRow="0" w:noHBand="0" w:noVBand="1" w:val="04A0"/>
       </w:tblPr>
       <w:tblGrid>
@@ -6365,6 +6376,7 @@
         <w:tblStyle w:val="LightGrid-Accent1"/>
         <w:tblW w:type="auto" w:w="0"/>
         <w:jc w:val="center"/>
+        <w:tblLayout w:type="autofit"/>
         <w:tblLook w:firstColumn="1" w:firstRow="1" w:lastColumn="0" w:lastRow="0" w:noHBand="0" w:noVBand="1" w:val="04A0"/>
       </w:tblPr>
       <w:tblGrid>
@@ -7384,6 +7396,7 @@
         <w:tblStyle w:val="LightGrid-Accent1"/>
         <w:tblW w:type="auto" w:w="0"/>
         <w:jc w:val="center"/>
+        <w:tblLayout w:type="autofit"/>
         <w:tblLook w:firstColumn="1" w:firstRow="1" w:lastColumn="0" w:lastRow="0" w:noHBand="0" w:noVBand="1" w:val="04A0"/>
       </w:tblPr>
       <w:tblGrid>
@@ -8802,6 +8815,7 @@
         <w:tblStyle w:val="LightGrid-Accent1"/>
         <w:tblW w:type="auto" w:w="0"/>
         <w:jc w:val="center"/>
+        <w:tblLayout w:type="autofit"/>
         <w:tblLook w:firstColumn="1" w:firstRow="1" w:lastColumn="0" w:lastRow="0" w:noHBand="0" w:noVBand="1" w:val="04A0"/>
       </w:tblPr>
       <w:tblGrid>
@@ -9558,6 +9572,7 @@
         <w:tblStyle w:val="LightGrid-Accent1"/>
         <w:tblW w:type="auto" w:w="0"/>
         <w:jc w:val="center"/>
+        <w:tblLayout w:type="autofit"/>
         <w:tblLook w:firstColumn="1" w:firstRow="1" w:lastColumn="0" w:lastRow="0" w:noHBand="0" w:noVBand="1" w:val="04A0"/>
       </w:tblPr>
       <w:tblGrid>
@@ -10475,6 +10490,7 @@
         <w:tblStyle w:val="LightGrid-Accent1"/>
         <w:tblW w:type="auto" w:w="0"/>
         <w:jc w:val="center"/>
+        <w:tblLayout w:type="autofit"/>
         <w:tblLook w:firstColumn="1" w:firstRow="1" w:lastColumn="0" w:lastRow="0" w:noHBand="0" w:noVBand="1" w:val="04A0"/>
       </w:tblPr>
       <w:tblGrid>
@@ -13869,6 +13885,7 @@
         <w:tblStyle w:val="LightGrid-Accent1"/>
         <w:tblW w:type="auto" w:w="0"/>
         <w:jc w:val="center"/>
+        <w:tblLayout w:type="autofit"/>
         <w:tblLook w:firstColumn="1" w:firstRow="1" w:lastColumn="0" w:lastRow="0" w:noHBand="0" w:noVBand="1" w:val="04A0"/>
       </w:tblPr>
       <w:tblGrid>
@@ -14634,6 +14651,7 @@
         <w:tblStyle w:val="LightGrid-Accent1"/>
         <w:tblW w:type="auto" w:w="0"/>
         <w:jc w:val="center"/>
+        <w:tblLayout w:type="autofit"/>
         <w:tblLook w:firstColumn="1" w:firstRow="1" w:lastColumn="0" w:lastRow="0" w:noHBand="0" w:noVBand="1" w:val="04A0"/>
       </w:tblPr>
       <w:tblGrid>
@@ -15014,6 +15032,7 @@
         <w:tblStyle w:val="LightGrid-Accent1"/>
         <w:tblW w:type="auto" w:w="0"/>
         <w:jc w:val="center"/>
+        <w:tblLayout w:type="autofit"/>
         <w:tblLook w:firstColumn="1" w:firstRow="1" w:lastColumn="0" w:lastRow="0" w:noHBand="0" w:noVBand="1" w:val="04A0"/>
       </w:tblPr>
       <w:tblGrid>
@@ -15227,6 +15246,7 @@
         <w:tblStyle w:val="LightGrid-Accent1"/>
         <w:tblW w:type="auto" w:w="0"/>
         <w:jc w:val="center"/>
+        <w:tblLayout w:type="autofit"/>
         <w:tblLook w:firstColumn="1" w:firstRow="1" w:lastColumn="0" w:lastRow="0" w:noHBand="0" w:noVBand="1" w:val="04A0"/>
       </w:tblPr>
       <w:tblGrid>
@@ -15688,6 +15708,7 @@
         <w:tblStyle w:val="LightGrid-Accent1"/>
         <w:tblW w:type="auto" w:w="0"/>
         <w:jc w:val="center"/>
+        <w:tblLayout w:type="autofit"/>
         <w:tblLook w:firstColumn="1" w:firstRow="1" w:lastColumn="0" w:lastRow="0" w:noHBand="0" w:noVBand="1" w:val="04A0"/>
       </w:tblPr>
       <w:tblGrid>
@@ -17473,6 +17494,7 @@
         <w:tblStyle w:val="LightGrid-Accent1"/>
         <w:tblW w:type="auto" w:w="0"/>
         <w:jc w:val="center"/>
+        <w:tblLayout w:type="autofit"/>
         <w:tblLook w:firstColumn="1" w:firstRow="1" w:lastColumn="0" w:lastRow="0" w:noHBand="0" w:noVBand="1" w:val="04A0"/>
       </w:tblPr>
       <w:tblGrid>

</xml_diff>